<commit_message>
ADDING TODAY'S WORK - 10.08.2026
</commit_message>
<xml_diff>
--- a/viva/viva_questions_plan.docx
+++ b/viva/viva_questions_plan.docx
@@ -51,15 +51,7 @@
         </w:numPr>
       </w:pPr>
       <w:r>
-        <w:t xml:space="preserve">One common last question is ‘if you have more money and time what </w:t>
-      </w:r>
-      <w:proofErr w:type="gramStart"/>
-      <w:r>
-        <w:t>would you</w:t>
-      </w:r>
-      <w:proofErr w:type="gramEnd"/>
-      <w:r>
-        <w:t xml:space="preserve"> do next?’ and ‘is your research useful to someone else?’</w:t>
+        <w:t>One common last question is ‘if you have more money and time what would you do next?’ and ‘is your research useful to someone else?’</w:t>
       </w:r>
     </w:p>
     <w:p>
@@ -493,15 +485,7 @@
         </w:numPr>
       </w:pPr>
       <w:r>
-        <w:t xml:space="preserve">Supplementary table 2 listing all the DE miRNAs </w:t>
-      </w:r>
-      <w:proofErr w:type="gramStart"/>
-      <w:r>
-        <w:t>is</w:t>
-      </w:r>
-      <w:proofErr w:type="gramEnd"/>
-      <w:r>
-        <w:t xml:space="preserve"> wrong for all the protease samples – it just shows the der p 1 inactive results for each of the protease conditions. </w:t>
+        <w:t xml:space="preserve">Supplementary table 2 listing all the DE miRNAs is wrong for all the protease samples – it just shows the der p 1 inactive results for each of the protease conditions. </w:t>
       </w:r>
       <w:r>
         <w:rPr>
@@ -515,23 +499,7 @@
           <w:b/>
           <w:bCs/>
         </w:rPr>
-        <w:t xml:space="preserve">in the local </w:t>
-      </w:r>
-      <w:proofErr w:type="spellStart"/>
-      <w:r>
-        <w:rPr>
-          <w:b/>
-          <w:bCs/>
-        </w:rPr>
-        <w:t>github</w:t>
-      </w:r>
-      <w:proofErr w:type="spellEnd"/>
-      <w:r>
-        <w:rPr>
-          <w:b/>
-          <w:bCs/>
-        </w:rPr>
-        <w:t xml:space="preserve"> folder but not pushed it</w:t>
+        <w:t>in the local github folder but not pushed it</w:t>
       </w:r>
     </w:p>
     <w:p/>
@@ -553,15 +521,7 @@
         </w:numPr>
       </w:pPr>
       <w:r>
-        <w:t xml:space="preserve">Why did you only perform ORA during target-gene </w:t>
-      </w:r>
-      <w:proofErr w:type="gramStart"/>
-      <w:r>
-        <w:t>enrichment</w:t>
-      </w:r>
-      <w:proofErr w:type="gramEnd"/>
-      <w:r>
-        <w:t xml:space="preserve"> but you performed ORA and miRNA-SEA at miRNA-level? </w:t>
+        <w:t xml:space="preserve">Why did you only perform ORA during target-gene enrichment but you performed ORA and miRNA-SEA at miRNA-level? </w:t>
       </w:r>
     </w:p>
     <w:p>
@@ -577,32 +537,7 @@
           <w:b/>
           <w:bCs/>
         </w:rPr>
-        <w:t xml:space="preserve">Could have used </w:t>
-      </w:r>
-      <w:proofErr w:type="spellStart"/>
-      <w:proofErr w:type="gramStart"/>
-      <w:r>
-        <w:rPr>
-          <w:b/>
-          <w:bCs/>
-        </w:rPr>
-        <w:t>gsePathway</w:t>
-      </w:r>
-      <w:proofErr w:type="spellEnd"/>
-      <w:r>
-        <w:rPr>
-          <w:b/>
-          <w:bCs/>
-        </w:rPr>
-        <w:t>(</w:t>
-      </w:r>
-      <w:proofErr w:type="gramEnd"/>
-      <w:r>
-        <w:rPr>
-          <w:b/>
-          <w:bCs/>
-        </w:rPr>
-        <w:t>)…</w:t>
+        <w:t>Could have used gsePathway()…</w:t>
       </w:r>
     </w:p>
     <w:p>
@@ -626,23 +561,7 @@
         </w:numPr>
       </w:pPr>
       <w:r>
-        <w:t>Why did you use a higher significance threshold for miRNA-level enrichment (</w:t>
-      </w:r>
-      <w:proofErr w:type="spellStart"/>
-      <w:r>
-        <w:t>Padj</w:t>
-      </w:r>
-      <w:proofErr w:type="spellEnd"/>
-      <w:r>
-        <w:t xml:space="preserve"> &lt; 0.05) over target gene (</w:t>
-      </w:r>
-      <w:proofErr w:type="spellStart"/>
-      <w:r>
-        <w:t>Padj</w:t>
-      </w:r>
-      <w:proofErr w:type="spellEnd"/>
-      <w:r>
-        <w:t xml:space="preserve"> &lt; 0.02)? </w:t>
+        <w:t xml:space="preserve">Why did you use a higher significance threshold for miRNA-level enrichment (Padj &lt; 0.05) over target gene (Padj &lt; 0.02)? </w:t>
       </w:r>
       <w:r>
         <w:rPr>
@@ -651,7 +570,6 @@
         </w:rPr>
         <w:t xml:space="preserve">Because there are fewer miRNA-pathway relationships and therefore there are likely to be fewer very significant pathways, so I didn’t want to miss anything by using a stricter threshold. Whereas, for target gene enrichment, the higher significance caused almost half of all </w:t>
       </w:r>
-      <w:proofErr w:type="spellStart"/>
       <w:r>
         <w:rPr>
           <w:b/>
@@ -659,7 +577,6 @@
         </w:rPr>
         <w:t>Reactome</w:t>
       </w:r>
-      <w:proofErr w:type="spellEnd"/>
       <w:r>
         <w:rPr>
           <w:b/>
@@ -693,55 +610,7 @@
           <w:b/>
           <w:bCs/>
         </w:rPr>
-        <w:t xml:space="preserve">Could look at detecting different types of small </w:t>
-      </w:r>
-      <w:proofErr w:type="spellStart"/>
-      <w:r>
-        <w:rPr>
-          <w:b/>
-          <w:bCs/>
-        </w:rPr>
-        <w:t>rna</w:t>
-      </w:r>
-      <w:proofErr w:type="spellEnd"/>
-      <w:r>
-        <w:rPr>
-          <w:b/>
-          <w:bCs/>
-        </w:rPr>
-        <w:t xml:space="preserve"> species e.g., what </w:t>
-      </w:r>
-      <w:proofErr w:type="spellStart"/>
-      <w:r>
-        <w:rPr>
-          <w:b/>
-          <w:bCs/>
-        </w:rPr>
-        <w:t>tamirna</w:t>
-      </w:r>
-      <w:proofErr w:type="spellEnd"/>
-      <w:r>
-        <w:rPr>
-          <w:b/>
-          <w:bCs/>
-        </w:rPr>
-        <w:t xml:space="preserve"> does in their </w:t>
-      </w:r>
-      <w:proofErr w:type="gramStart"/>
-      <w:r>
-        <w:rPr>
-          <w:b/>
-          <w:bCs/>
-        </w:rPr>
-        <w:t>reads</w:t>
-      </w:r>
-      <w:proofErr w:type="gramEnd"/>
-      <w:r>
-        <w:rPr>
-          <w:b/>
-          <w:bCs/>
-        </w:rPr>
-        <w:t xml:space="preserve"> classification table</w:t>
+        <w:t>Could look at detecting different types of small rna species e.g., what tamirna does in their reads classification table</w:t>
       </w:r>
     </w:p>
     <w:p>
@@ -805,35 +674,38 @@
           <w:b/>
           <w:bCs/>
         </w:rPr>
-        <w:t xml:space="preserve">It is also possible that they are working agonistically because the target genes being targeted by upregulated are stimulatory and the downregulated ones are inhibitory </w:t>
-      </w:r>
-      <w:proofErr w:type="gramStart"/>
+        <w:t>It is also possible that they are working agonistically because the target genes being targeted by upregulated are stimulatory and the downregulated ones are inhibitory therefore they are working in the same direction</w:t>
+      </w:r>
+    </w:p>
+    <w:p>
+      <w:pPr>
+        <w:pStyle w:val="ListParagraph"/>
+        <w:numPr>
+          <w:ilvl w:val="0"/>
+          <w:numId w:val="5"/>
+        </w:numPr>
+      </w:pPr>
+      <w:r>
+        <w:t>How do WNT and NOTCH regulate epithelial barrier integrity in the upregulated target gene pathways and RHO GTPases in the downregulated?</w:t>
+      </w:r>
+    </w:p>
+    <w:p>
+      <w:pPr>
+        <w:pStyle w:val="ListParagraph"/>
+        <w:numPr>
+          <w:ilvl w:val="0"/>
+          <w:numId w:val="5"/>
+        </w:numPr>
+      </w:pPr>
+      <w:r>
+        <w:t xml:space="preserve">Why is RT-qPCR necessary if you already have small RNA-seq data? </w:t>
+      </w:r>
       <w:r>
         <w:rPr>
           <w:b/>
           <w:bCs/>
         </w:rPr>
-        <w:t>therefore</w:t>
-      </w:r>
-      <w:proofErr w:type="gramEnd"/>
-      <w:r>
-        <w:rPr>
-          <w:b/>
-          <w:bCs/>
-        </w:rPr>
-        <w:t xml:space="preserve"> they are working in the same direction</w:t>
-      </w:r>
-    </w:p>
-    <w:p>
-      <w:pPr>
-        <w:pStyle w:val="ListParagraph"/>
-        <w:numPr>
-          <w:ilvl w:val="0"/>
-          <w:numId w:val="5"/>
-        </w:numPr>
-      </w:pPr>
-      <w:r>
-        <w:t>How do WNT and NOTCH regulate epithelial barrier integrity in the upregulated target gene pathways and RHO GTPases in the downregulated?</w:t>
+        <w:t>Small RNA-seq is genome-wide whereas PCR is very specific. Using both methods reduces the risk that results were found due to technical artefacts.</w:t>
       </w:r>
     </w:p>
     <w:p/>

</xml_diff>

<commit_message>
ADDING TODAY'S WORK - 17.08.2026
</commit_message>
<xml_diff>
--- a/viva/viva_questions_plan.docx
+++ b/viva/viva_questions_plan.docx
@@ -1,6 +1,6 @@
 
 <file path=word/document.xml><?xml version="1.0" encoding="utf-8"?>
-<w:document xmlns:wpc="http://schemas.microsoft.com/office/word/2010/wordprocessingCanvas" xmlns:cx="http://schemas.microsoft.com/office/drawing/2014/chartex" xmlns:cx1="http://schemas.microsoft.com/office/drawing/2015/9/8/chartex" xmlns:cx2="http://schemas.microsoft.com/office/drawing/2015/10/21/chartex" xmlns:cx3="http://schemas.microsoft.com/office/drawing/2016/5/9/chartex" xmlns:cx4="http://schemas.microsoft.com/office/drawing/2016/5/10/chartex" xmlns:cx5="http://schemas.microsoft.com/office/drawing/2016/5/11/chartex" xmlns:cx6="http://schemas.microsoft.com/office/drawing/2016/5/12/chartex" xmlns:cx7="http://schemas.microsoft.com/office/drawing/2016/5/13/chartex" xmlns:cx8="http://schemas.microsoft.com/office/drawing/2016/5/14/chartex" xmlns:mc="http://schemas.openxmlformats.org/markup-compatibility/2006" xmlns:m="http://schemas.openxmlformats.org/officeDocument/2006/math" xmlns:aink="http://schemas.microsoft.com/office/drawing/2016/ink" xmlns:am3d="http://schemas.microsoft.com/office/drawing/2017/model3d" xmlns:oel="http://schemas.microsoft.com/office/2019/extlst" xmlns:r="http://schemas.openxmlformats.org/officeDocument/2006/relationships" xmlns:wp14="http://schemas.microsoft.com/office/word/2010/wordprocessingDrawing" xmlns:wp="http://schemas.openxmlformats.org/drawingml/2006/wordprocessingDrawing" xmlns:wpg="http://schemas.microsoft.com/office/word/2010/wordprocessingGroup" xmlns:wpi="http://schemas.microsoft.com/office/word/2010/wordprocessingInk" xmlns:wps="http://schemas.microsoft.com/office/word/2010/wordprocessingShape" xmlns:o="urn:schemas-microsoft-com:office:office" xmlns:v="urn:schemas-microsoft-com:vml" xmlns:w10="urn:schemas-microsoft-com:office:word" xmlns:w="http://schemas.openxmlformats.org/wordprocessingml/2006/main" xmlns:w14="http://schemas.microsoft.com/office/word/2010/wordml" xmlns:w15="http://schemas.microsoft.com/office/word/2012/wordml" xmlns:w16cei="http://schemas.microsoft.com/office/word/2026/wordml/cei" xmlns:w16cex="http://schemas.microsoft.com/office/word/2018/wordml/cex" xmlns:w16cid="http://schemas.microsoft.com/office/word/2016/wordml/cid" xmlns:w16="http://schemas.microsoft.com/office/word/2018/wordml" xmlns:w16sdtdh="http://schemas.microsoft.com/office/word/2020/wordml/sdtdatahash" xmlns:w16sdtfl="http://schemas.microsoft.com/office/word/2024/wordml/sdtformatlock" xmlns:w16se="http://schemas.microsoft.com/office/word/2015/wordml/symex" xmlns:w16du="http://schemas.microsoft.com/office/word/2023/wordml/word16du" xmlns:wne="http://schemas.microsoft.com/office/word/2006/wordml" mc:Ignorable="w14 w15 w16se w16cid w16 w16cex w16sdtdh w16sdtfl w16du wp14">
+<w:document xmlns:wpc="http://schemas.microsoft.com/office/word/2010/wordprocessingCanvas" xmlns:cx="http://schemas.microsoft.com/office/drawing/2014/chartex" xmlns:cx1="http://schemas.microsoft.com/office/drawing/2015/9/8/chartex" xmlns:cx2="http://schemas.microsoft.com/office/drawing/2015/10/21/chartex" xmlns:cx3="http://schemas.microsoft.com/office/drawing/2016/5/9/chartex" xmlns:cx4="http://schemas.microsoft.com/office/drawing/2016/5/10/chartex" xmlns:cx5="http://schemas.microsoft.com/office/drawing/2016/5/11/chartex" xmlns:cx6="http://schemas.microsoft.com/office/drawing/2016/5/12/chartex" xmlns:cx7="http://schemas.microsoft.com/office/drawing/2016/5/13/chartex" xmlns:cx8="http://schemas.microsoft.com/office/drawing/2016/5/14/chartex" xmlns:mc="http://schemas.openxmlformats.org/markup-compatibility/2006" xmlns:m="http://schemas.openxmlformats.org/officeDocument/2006/math" xmlns:aink="http://schemas.microsoft.com/office/drawing/2016/ink" xmlns:am3d="http://schemas.microsoft.com/office/drawing/2017/model3d" xmlns:oel="http://schemas.microsoft.com/office/2019/extlst" xmlns:r="http://schemas.openxmlformats.org/officeDocument/2006/relationships" xmlns:wp14="http://schemas.microsoft.com/office/word/2010/wordprocessingDrawing" xmlns:wp="http://schemas.openxmlformats.org/drawingml/2006/wordprocessingDrawing" xmlns:wpg="http://schemas.microsoft.com/office/word/2010/wordprocessingGroup" xmlns:wpi="http://schemas.microsoft.com/office/word/2010/wordprocessingInk" xmlns:wps="http://schemas.microsoft.com/office/word/2010/wordprocessingShape" xmlns:o="urn:schemas-microsoft-com:office:office" xmlns:v="urn:schemas-microsoft-com:vml" xmlns:w10="urn:schemas-microsoft-com:office:word" xmlns:w="http://schemas.openxmlformats.org/wordprocessingml/2006/main" xmlns:w14="http://schemas.microsoft.com/office/word/2010/wordml" xmlns:w15="http://schemas.microsoft.com/office/word/2012/wordml" xmlns:w16cex="http://schemas.microsoft.com/office/word/2018/wordml/cex" xmlns:w16cid="http://schemas.microsoft.com/office/word/2016/wordml/cid" xmlns:w16="http://schemas.microsoft.com/office/word/2018/wordml" xmlns:w16sdtdh="http://schemas.microsoft.com/office/word/2020/wordml/sdtdatahash" xmlns:w16sdtfl="http://schemas.microsoft.com/office/word/2024/wordml/sdtformatlock" xmlns:w16se="http://schemas.microsoft.com/office/word/2015/wordml/symex" xmlns:w16du="http://schemas.microsoft.com/office/word/2023/wordml/word16du" xmlns:wne="http://schemas.microsoft.com/office/word/2006/wordml" mc:Ignorable="w14 w15 w16se w16cid w16 w16cex w16sdtdh w16sdtfl w16du wp14">
   <w:body>
     <w:p>
       <w:pPr>
@@ -706,6 +706,114 @@
           <w:bCs/>
         </w:rPr>
         <w:t>Small RNA-seq is genome-wide whereas PCR is very specific. Using both methods reduces the risk that results were found due to technical artefacts.</w:t>
+      </w:r>
+    </w:p>
+    <w:p>
+      <w:pPr>
+        <w:pStyle w:val="ListParagraph"/>
+        <w:numPr>
+          <w:ilvl w:val="0"/>
+          <w:numId w:val="5"/>
+        </w:numPr>
+      </w:pPr>
+      <w:r>
+        <w:t xml:space="preserve">You say more work is required to confirm that higher levels of rRNA and tRNA are observed in the three dose 24 primary HBEC samples. What further work would you do to confirm this? </w:t>
+      </w:r>
+      <w:r>
+        <w:rPr>
+          <w:b/>
+          <w:bCs/>
+        </w:rPr>
+        <w:t>More samples, more donors, look at more RNA species other than just rRNA and tRNA – can use databases containing these sequences to perform this.</w:t>
+      </w:r>
+    </w:p>
+    <w:p>
+      <w:pPr>
+        <w:pStyle w:val="ListParagraph"/>
+        <w:numPr>
+          <w:ilvl w:val="0"/>
+          <w:numId w:val="5"/>
+        </w:numPr>
+      </w:pPr>
+      <w:r>
+        <w:t xml:space="preserve">What was the greatest challenge of the project? </w:t>
+      </w:r>
+    </w:p>
+    <w:p>
+      <w:pPr>
+        <w:pStyle w:val="ListParagraph"/>
+        <w:numPr>
+          <w:ilvl w:val="1"/>
+          <w:numId w:val="5"/>
+        </w:numPr>
+      </w:pPr>
+      <w:r>
+        <w:rPr>
+          <w:b/>
+          <w:bCs/>
+        </w:rPr>
+        <w:t>The greatest technical challenge was developing the method for the pathway enrichment analysis because there were so many target genes that it was almost the whole proteome and there were so many different filtering techniques that weren’t biologically robust enough or were locked behind paywalls or lack of matched mRNA data.</w:t>
+      </w:r>
+    </w:p>
+    <w:p>
+      <w:pPr>
+        <w:pStyle w:val="ListParagraph"/>
+        <w:numPr>
+          <w:ilvl w:val="1"/>
+          <w:numId w:val="5"/>
+        </w:numPr>
+      </w:pPr>
+      <w:r>
+        <w:rPr>
+          <w:b/>
+          <w:bCs/>
+        </w:rPr>
+        <w:t>The greatest overall challenge was deciding what the project was actually about. Because I received the data in a staggered way, the aim of the project kept changing based on the results of the data as I could no longer do what I set out to do. This is a good example of how projects can change over time and when you are doing stuff in a short time period, you may not be able to reach the depth of analysis you might like to.</w:t>
+      </w:r>
+    </w:p>
+    <w:p>
+      <w:pPr>
+        <w:pStyle w:val="ListParagraph"/>
+        <w:numPr>
+          <w:ilvl w:val="0"/>
+          <w:numId w:val="5"/>
+        </w:numPr>
+      </w:pPr>
+      <w:r>
+        <w:t xml:space="preserve">You say very low levels of miRNA were detected – what would be an acceptable level of miRNA for this experiment and how would you suggest it be extracted? </w:t>
+      </w:r>
+    </w:p>
+    <w:p>
+      <w:pPr>
+        <w:pStyle w:val="ListParagraph"/>
+        <w:numPr>
+          <w:ilvl w:val="1"/>
+          <w:numId w:val="5"/>
+        </w:numPr>
+      </w:pPr>
+      <w:r>
+        <w:rPr>
+          <w:b/>
+          <w:bCs/>
+        </w:rPr>
+        <w:lastRenderedPageBreak/>
+        <w:t xml:space="preserve">[check references for how much miRNA other studies used]. More samples could help compensate for lower levels of miRNA. </w:t>
+      </w:r>
+    </w:p>
+    <w:p>
+      <w:pPr>
+        <w:pStyle w:val="ListParagraph"/>
+        <w:numPr>
+          <w:ilvl w:val="1"/>
+          <w:numId w:val="5"/>
+        </w:numPr>
+      </w:pPr>
+      <w:r>
+        <w:rPr>
+          <w:b/>
+          <w:bCs/>
+        </w:rPr>
+        <w:t xml:space="preserve">Extracellular vesicles are produced variably among cell and tissue types therefore it is difficult for a one-size-fits-all approach. Additionally, EVs are produced more readily form airway epithelial cells in response to allergens which makes it trickier to get enough miRNA for reliable control samples which all DE analysis is performed against. </w:t>
       </w:r>
     </w:p>
     <w:p/>
@@ -731,7 +839,7 @@
 </file>
 
 <file path=word/numbering.xml><?xml version="1.0" encoding="utf-8"?>
-<w:numbering xmlns:wpc="http://schemas.microsoft.com/office/word/2010/wordprocessingCanvas" xmlns:cx="http://schemas.microsoft.com/office/drawing/2014/chartex" xmlns:cx1="http://schemas.microsoft.com/office/drawing/2015/9/8/chartex" xmlns:cx2="http://schemas.microsoft.com/office/drawing/2015/10/21/chartex" xmlns:cx3="http://schemas.microsoft.com/office/drawing/2016/5/9/chartex" xmlns:cx4="http://schemas.microsoft.com/office/drawing/2016/5/10/chartex" xmlns:cx5="http://schemas.microsoft.com/office/drawing/2016/5/11/chartex" xmlns:cx6="http://schemas.microsoft.com/office/drawing/2016/5/12/chartex" xmlns:cx7="http://schemas.microsoft.com/office/drawing/2016/5/13/chartex" xmlns:cx8="http://schemas.microsoft.com/office/drawing/2016/5/14/chartex" xmlns:mc="http://schemas.openxmlformats.org/markup-compatibility/2006" xmlns:m="http://schemas.openxmlformats.org/officeDocument/2006/math" xmlns:aink="http://schemas.microsoft.com/office/drawing/2016/ink" xmlns:am3d="http://schemas.microsoft.com/office/drawing/2017/model3d" xmlns:oel="http://schemas.microsoft.com/office/2019/extlst" xmlns:r="http://schemas.openxmlformats.org/officeDocument/2006/relationships" xmlns:wp14="http://schemas.microsoft.com/office/word/2010/wordprocessingDrawing" xmlns:wp="http://schemas.openxmlformats.org/drawingml/2006/wordprocessingDrawing" xmlns:wpg="http://schemas.microsoft.com/office/word/2010/wordprocessingGroup" xmlns:wpi="http://schemas.microsoft.com/office/word/2010/wordprocessingInk" xmlns:wps="http://schemas.microsoft.com/office/word/2010/wordprocessingShape" xmlns:o="urn:schemas-microsoft-com:office:office" xmlns:v="urn:schemas-microsoft-com:vml" xmlns:w10="urn:schemas-microsoft-com:office:word" xmlns:w="http://schemas.openxmlformats.org/wordprocessingml/2006/main" xmlns:w14="http://schemas.microsoft.com/office/word/2010/wordml" xmlns:w15="http://schemas.microsoft.com/office/word/2012/wordml" xmlns:w16cei="http://schemas.microsoft.com/office/word/2026/wordml/cei" xmlns:w16cex="http://schemas.microsoft.com/office/word/2018/wordml/cex" xmlns:w16cid="http://schemas.microsoft.com/office/word/2016/wordml/cid" xmlns:w16="http://schemas.microsoft.com/office/word/2018/wordml" xmlns:w16sdtdh="http://schemas.microsoft.com/office/word/2020/wordml/sdtdatahash" xmlns:w16sdtfl="http://schemas.microsoft.com/office/word/2024/wordml/sdtformatlock" xmlns:w16se="http://schemas.microsoft.com/office/word/2015/wordml/symex" xmlns:w16du="http://schemas.microsoft.com/office/word/2023/wordml/word16du" xmlns:wne="http://schemas.microsoft.com/office/word/2006/wordml" mc:Ignorable="w14 w15 w16se w16cid w16 w16cex w16sdtdh w16sdtfl w16du wp14">
+<w:numbering xmlns:wpc="http://schemas.microsoft.com/office/word/2010/wordprocessingCanvas" xmlns:cx="http://schemas.microsoft.com/office/drawing/2014/chartex" xmlns:cx1="http://schemas.microsoft.com/office/drawing/2015/9/8/chartex" xmlns:cx2="http://schemas.microsoft.com/office/drawing/2015/10/21/chartex" xmlns:cx3="http://schemas.microsoft.com/office/drawing/2016/5/9/chartex" xmlns:cx4="http://schemas.microsoft.com/office/drawing/2016/5/10/chartex" xmlns:cx5="http://schemas.microsoft.com/office/drawing/2016/5/11/chartex" xmlns:cx6="http://schemas.microsoft.com/office/drawing/2016/5/12/chartex" xmlns:cx7="http://schemas.microsoft.com/office/drawing/2016/5/13/chartex" xmlns:cx8="http://schemas.microsoft.com/office/drawing/2016/5/14/chartex" xmlns:mc="http://schemas.openxmlformats.org/markup-compatibility/2006" xmlns:m="http://schemas.openxmlformats.org/officeDocument/2006/math" xmlns:aink="http://schemas.microsoft.com/office/drawing/2016/ink" xmlns:am3d="http://schemas.microsoft.com/office/drawing/2017/model3d" xmlns:oel="http://schemas.microsoft.com/office/2019/extlst" xmlns:r="http://schemas.openxmlformats.org/officeDocument/2006/relationships" xmlns:wp14="http://schemas.microsoft.com/office/word/2010/wordprocessingDrawing" xmlns:wp="http://schemas.openxmlformats.org/drawingml/2006/wordprocessingDrawing" xmlns:wpg="http://schemas.microsoft.com/office/word/2010/wordprocessingGroup" xmlns:wpi="http://schemas.microsoft.com/office/word/2010/wordprocessingInk" xmlns:wps="http://schemas.microsoft.com/office/word/2010/wordprocessingShape" xmlns:o="urn:schemas-microsoft-com:office:office" xmlns:v="urn:schemas-microsoft-com:vml" xmlns:w10="urn:schemas-microsoft-com:office:word" xmlns:w="http://schemas.openxmlformats.org/wordprocessingml/2006/main" xmlns:w14="http://schemas.microsoft.com/office/word/2010/wordml" xmlns:w15="http://schemas.microsoft.com/office/word/2012/wordml" xmlns:w16cex="http://schemas.microsoft.com/office/word/2018/wordml/cex" xmlns:w16cid="http://schemas.microsoft.com/office/word/2016/wordml/cid" xmlns:w16="http://schemas.microsoft.com/office/word/2018/wordml" xmlns:w16sdtdh="http://schemas.microsoft.com/office/word/2020/wordml/sdtdatahash" xmlns:w16sdtfl="http://schemas.microsoft.com/office/word/2024/wordml/sdtformatlock" xmlns:w16se="http://schemas.microsoft.com/office/word/2015/wordml/symex" xmlns:w16du="http://schemas.microsoft.com/office/word/2023/wordml/word16du" xmlns:wne="http://schemas.microsoft.com/office/word/2006/wordml" mc:Ignorable="w14 w15 w16se w16cid w16 w16cex w16sdtdh w16sdtfl w16du wp14">
   <w:abstractNum w:abstractNumId="0" w15:restartNumberingAfterBreak="0">
     <w:nsid w:val="05D32B00"/>
     <w:multiLevelType w:val="hybridMultilevel"/>

</xml_diff>

<commit_message>
ADDING TODAY'S WORK - 18.08.2026
</commit_message>
<xml_diff>
--- a/viva/viva_questions_plan.docx
+++ b/viva/viva_questions_plan.docx
@@ -51,7 +51,15 @@
         </w:numPr>
       </w:pPr>
       <w:r>
-        <w:t>One common last question is ‘if you have more money and time what would you do next?’ and ‘is your research useful to someone else?’</w:t>
+        <w:t xml:space="preserve">One common last question is ‘if you have more money and time what </w:t>
+      </w:r>
+      <w:proofErr w:type="gramStart"/>
+      <w:r>
+        <w:t>would you</w:t>
+      </w:r>
+      <w:proofErr w:type="gramEnd"/>
+      <w:r>
+        <w:t xml:space="preserve"> do next?’ and ‘is your research useful to someone else?’</w:t>
       </w:r>
     </w:p>
     <w:p>
@@ -485,7 +493,15 @@
         </w:numPr>
       </w:pPr>
       <w:r>
-        <w:t xml:space="preserve">Supplementary table 2 listing all the DE miRNAs is wrong for all the protease samples – it just shows the der p 1 inactive results for each of the protease conditions. </w:t>
+        <w:t xml:space="preserve">Supplementary table 2 listing all the DE miRNAs </w:t>
+      </w:r>
+      <w:proofErr w:type="gramStart"/>
+      <w:r>
+        <w:t>is</w:t>
+      </w:r>
+      <w:proofErr w:type="gramEnd"/>
+      <w:r>
+        <w:t xml:space="preserve"> wrong for all the protease samples – it just shows the der p 1 inactive results for each of the protease conditions. </w:t>
       </w:r>
       <w:r>
         <w:rPr>
@@ -499,7 +515,23 @@
           <w:b/>
           <w:bCs/>
         </w:rPr>
-        <w:t>in the local github folder but not pushed it</w:t>
+        <w:t xml:space="preserve">in the local </w:t>
+      </w:r>
+      <w:proofErr w:type="spellStart"/>
+      <w:r>
+        <w:rPr>
+          <w:b/>
+          <w:bCs/>
+        </w:rPr>
+        <w:t>github</w:t>
+      </w:r>
+      <w:proofErr w:type="spellEnd"/>
+      <w:r>
+        <w:rPr>
+          <w:b/>
+          <w:bCs/>
+        </w:rPr>
+        <w:t xml:space="preserve"> folder but not pushed it</w:t>
       </w:r>
     </w:p>
     <w:p/>
@@ -521,7 +553,15 @@
         </w:numPr>
       </w:pPr>
       <w:r>
-        <w:t xml:space="preserve">Why did you only perform ORA during target-gene enrichment but you performed ORA and miRNA-SEA at miRNA-level? </w:t>
+        <w:t xml:space="preserve">Why did you only perform ORA during target-gene </w:t>
+      </w:r>
+      <w:proofErr w:type="gramStart"/>
+      <w:r>
+        <w:t>enrichment</w:t>
+      </w:r>
+      <w:proofErr w:type="gramEnd"/>
+      <w:r>
+        <w:t xml:space="preserve"> but you performed ORA and miRNA-SEA at miRNA-level? </w:t>
       </w:r>
     </w:p>
     <w:p>
@@ -537,7 +577,32 @@
           <w:b/>
           <w:bCs/>
         </w:rPr>
-        <w:t>Could have used gsePathway()…</w:t>
+        <w:t xml:space="preserve">Could have used </w:t>
+      </w:r>
+      <w:proofErr w:type="spellStart"/>
+      <w:proofErr w:type="gramStart"/>
+      <w:r>
+        <w:rPr>
+          <w:b/>
+          <w:bCs/>
+        </w:rPr>
+        <w:t>gsePathway</w:t>
+      </w:r>
+      <w:proofErr w:type="spellEnd"/>
+      <w:r>
+        <w:rPr>
+          <w:b/>
+          <w:bCs/>
+        </w:rPr>
+        <w:t>(</w:t>
+      </w:r>
+      <w:proofErr w:type="gramEnd"/>
+      <w:r>
+        <w:rPr>
+          <w:b/>
+          <w:bCs/>
+        </w:rPr>
+        <w:t>)…</w:t>
       </w:r>
     </w:p>
     <w:p>
@@ -561,7 +626,23 @@
         </w:numPr>
       </w:pPr>
       <w:r>
-        <w:t xml:space="preserve">Why did you use a higher significance threshold for miRNA-level enrichment (Padj &lt; 0.05) over target gene (Padj &lt; 0.02)? </w:t>
+        <w:t>Why did you use a higher significance threshold for miRNA-level enrichment (</w:t>
+      </w:r>
+      <w:proofErr w:type="spellStart"/>
+      <w:r>
+        <w:t>Padj</w:t>
+      </w:r>
+      <w:proofErr w:type="spellEnd"/>
+      <w:r>
+        <w:t xml:space="preserve"> &lt; 0.05) over target gene (</w:t>
+      </w:r>
+      <w:proofErr w:type="spellStart"/>
+      <w:r>
+        <w:t>Padj</w:t>
+      </w:r>
+      <w:proofErr w:type="spellEnd"/>
+      <w:r>
+        <w:t xml:space="preserve"> &lt; 0.02)? </w:t>
       </w:r>
       <w:r>
         <w:rPr>
@@ -570,6 +651,7 @@
         </w:rPr>
         <w:t xml:space="preserve">Because there are fewer miRNA-pathway relationships and therefore there are likely to be fewer very significant pathways, so I didn’t want to miss anything by using a stricter threshold. Whereas, for target gene enrichment, the higher significance caused almost half of all </w:t>
       </w:r>
+      <w:proofErr w:type="spellStart"/>
       <w:r>
         <w:rPr>
           <w:b/>
@@ -577,6 +659,7 @@
         </w:rPr>
         <w:t>Reactome</w:t>
       </w:r>
+      <w:proofErr w:type="spellEnd"/>
       <w:r>
         <w:rPr>
           <w:b/>
@@ -610,7 +693,55 @@
           <w:b/>
           <w:bCs/>
         </w:rPr>
-        <w:t>Could look at detecting different types of small rna species e.g., what tamirna does in their reads classification table</w:t>
+        <w:t xml:space="preserve">Could look at detecting different types of small </w:t>
+      </w:r>
+      <w:proofErr w:type="spellStart"/>
+      <w:r>
+        <w:rPr>
+          <w:b/>
+          <w:bCs/>
+        </w:rPr>
+        <w:t>rna</w:t>
+      </w:r>
+      <w:proofErr w:type="spellEnd"/>
+      <w:r>
+        <w:rPr>
+          <w:b/>
+          <w:bCs/>
+        </w:rPr>
+        <w:t xml:space="preserve"> species e.g., what </w:t>
+      </w:r>
+      <w:proofErr w:type="spellStart"/>
+      <w:r>
+        <w:rPr>
+          <w:b/>
+          <w:bCs/>
+        </w:rPr>
+        <w:t>tamirna</w:t>
+      </w:r>
+      <w:proofErr w:type="spellEnd"/>
+      <w:r>
+        <w:rPr>
+          <w:b/>
+          <w:bCs/>
+        </w:rPr>
+        <w:t xml:space="preserve"> does in their </w:t>
+      </w:r>
+      <w:proofErr w:type="gramStart"/>
+      <w:r>
+        <w:rPr>
+          <w:b/>
+          <w:bCs/>
+        </w:rPr>
+        <w:t>reads</w:t>
+      </w:r>
+      <w:proofErr w:type="gramEnd"/>
+      <w:r>
+        <w:rPr>
+          <w:b/>
+          <w:bCs/>
+        </w:rPr>
+        <w:t xml:space="preserve"> classification table</w:t>
       </w:r>
     </w:p>
     <w:p>
@@ -674,7 +805,23 @@
           <w:b/>
           <w:bCs/>
         </w:rPr>
-        <w:t>It is also possible that they are working agonistically because the target genes being targeted by upregulated are stimulatory and the downregulated ones are inhibitory therefore they are working in the same direction</w:t>
+        <w:t xml:space="preserve">It is also possible that they are working agonistically because the target genes being targeted by upregulated are stimulatory and the downregulated ones are inhibitory </w:t>
+      </w:r>
+      <w:proofErr w:type="gramStart"/>
+      <w:r>
+        <w:rPr>
+          <w:b/>
+          <w:bCs/>
+        </w:rPr>
+        <w:t>therefore</w:t>
+      </w:r>
+      <w:proofErr w:type="gramEnd"/>
+      <w:r>
+        <w:rPr>
+          <w:b/>
+          <w:bCs/>
+        </w:rPr>
+        <w:t xml:space="preserve"> they are working in the same direction</w:t>
       </w:r>
     </w:p>
     <w:p>
@@ -698,14 +845,38 @@
         </w:numPr>
       </w:pPr>
       <w:r>
-        <w:t xml:space="preserve">Why is RT-qPCR necessary if you already have small RNA-seq data? </w:t>
-      </w:r>
-      <w:r>
-        <w:rPr>
-          <w:b/>
-          <w:bCs/>
-        </w:rPr>
-        <w:t>Small RNA-seq is genome-wide whereas PCR is very specific. Using both methods reduces the risk that results were found due to technical artefacts.</w:t>
+        <w:t>Why is RT-qPCR necessary if you already have small RNA-</w:t>
+      </w:r>
+      <w:proofErr w:type="spellStart"/>
+      <w:r>
+        <w:t>seq</w:t>
+      </w:r>
+      <w:proofErr w:type="spellEnd"/>
+      <w:r>
+        <w:t xml:space="preserve"> data? </w:t>
+      </w:r>
+      <w:r>
+        <w:rPr>
+          <w:b/>
+          <w:bCs/>
+        </w:rPr>
+        <w:t>Small RNA-</w:t>
+      </w:r>
+      <w:proofErr w:type="spellStart"/>
+      <w:r>
+        <w:rPr>
+          <w:b/>
+          <w:bCs/>
+        </w:rPr>
+        <w:t>seq</w:t>
+      </w:r>
+      <w:proofErr w:type="spellEnd"/>
+      <w:r>
+        <w:rPr>
+          <w:b/>
+          <w:bCs/>
+        </w:rPr>
+        <w:t xml:space="preserve"> is genome-wide whereas PCR is very specific. Using both methods reduces the risk that results were found due to technical artefacts.</w:t>
       </w:r>
     </w:p>
     <w:p>
@@ -768,7 +939,39 @@
           <w:b/>
           <w:bCs/>
         </w:rPr>
-        <w:t>The greatest overall challenge was deciding what the project was actually about. Because I received the data in a staggered way, the aim of the project kept changing based on the results of the data as I could no longer do what I set out to do. This is a good example of how projects can change over time and when you are doing stuff in a short time period, you may not be able to reach the depth of analysis you might like to.</w:t>
+        <w:t xml:space="preserve">The greatest overall challenge was deciding what the project was </w:t>
+      </w:r>
+      <w:proofErr w:type="gramStart"/>
+      <w:r>
+        <w:rPr>
+          <w:b/>
+          <w:bCs/>
+        </w:rPr>
+        <w:t>actually about</w:t>
+      </w:r>
+      <w:proofErr w:type="gramEnd"/>
+      <w:r>
+        <w:rPr>
+          <w:b/>
+          <w:bCs/>
+        </w:rPr>
+        <w:t xml:space="preserve">. Because I received the data in a staggered way, the aim of the project kept changing based on the results of the data as I could no longer do what I set out to do. This is a good example of how projects can change over time and when you are doing stuff in a short </w:t>
+      </w:r>
+      <w:proofErr w:type="gramStart"/>
+      <w:r>
+        <w:rPr>
+          <w:b/>
+          <w:bCs/>
+        </w:rPr>
+        <w:t>time period</w:t>
+      </w:r>
+      <w:proofErr w:type="gramEnd"/>
+      <w:r>
+        <w:rPr>
+          <w:b/>
+          <w:bCs/>
+        </w:rPr>
+        <w:t>, you may not be able to reach the depth of analysis you might like to.</w:t>
       </w:r>
     </w:p>
     <w:p>
@@ -814,6 +1017,37 @@
           <w:bCs/>
         </w:rPr>
         <w:t xml:space="preserve">Extracellular vesicles are produced variably among cell and tissue types therefore it is difficult for a one-size-fits-all approach. Additionally, EVs are produced more readily form airway epithelial cells in response to allergens which makes it trickier to get enough miRNA for reliable control samples which all DE analysis is performed against. </w:t>
+      </w:r>
+    </w:p>
+    <w:p>
+      <w:pPr>
+        <w:pStyle w:val="ListParagraph"/>
+        <w:numPr>
+          <w:ilvl w:val="0"/>
+          <w:numId w:val="5"/>
+        </w:numPr>
+      </w:pPr>
+      <w:r>
+        <w:t xml:space="preserve">You say that pathway enrichment analysis was not suitable for the Calu-3 dataset as there was insufficient levels of differential expression. How much differential expression would be enough? </w:t>
+      </w:r>
+      <w:r>
+        <w:rPr>
+          <w:b/>
+          <w:bCs/>
+        </w:rPr>
+        <w:t xml:space="preserve">I haven’t been able to find anything that is a clear threshold for this as it can depend on how well researched the miRNAs are and other factors but &gt;10 would probably be a rough minimum. </w:t>
+      </w:r>
+    </w:p>
+    <w:p>
+      <w:pPr>
+        <w:pStyle w:val="ListParagraph"/>
+        <w:numPr>
+          <w:ilvl w:val="0"/>
+          <w:numId w:val="5"/>
+        </w:numPr>
+      </w:pPr>
+      <w:r>
+        <w:t xml:space="preserve">You say more research is required to validate the finding that miR-125b-5p may be a common allergen response miRNA – what would that extra research be? </w:t>
       </w:r>
     </w:p>
     <w:p/>
@@ -2275,7 +2509,7 @@
         <w:ind w:left="1440" w:hanging="360"/>
       </w:pPr>
     </w:lvl>
-    <w:lvl w:ilvl="2" w:tplc="0809001B" w:tentative="1">
+    <w:lvl w:ilvl="2" w:tplc="0809001B">
       <w:start w:val="1"/>
       <w:numFmt w:val="lowerRoman"/>
       <w:lvlText w:val="%3."/>

</xml_diff>

<commit_message>
ADDING TODAY'S WORK - 20.08.2026
</commit_message>
<xml_diff>
--- a/viva/viva_questions_plan.docx
+++ b/viva/viva_questions_plan.docx
@@ -51,15 +51,7 @@
         </w:numPr>
       </w:pPr>
       <w:r>
-        <w:t xml:space="preserve">One common last question is ‘if you have more money and time what </w:t>
-      </w:r>
-      <w:proofErr w:type="gramStart"/>
-      <w:r>
-        <w:t>would you</w:t>
-      </w:r>
-      <w:proofErr w:type="gramEnd"/>
-      <w:r>
-        <w:t xml:space="preserve"> do next?’ and ‘is your research useful to someone else?’</w:t>
+        <w:t>One common last question is ‘if you have more money and time what would you do next?’ and ‘is your research useful to someone else?’</w:t>
       </w:r>
     </w:p>
     <w:p>
@@ -493,15 +485,7 @@
         </w:numPr>
       </w:pPr>
       <w:r>
-        <w:t xml:space="preserve">Supplementary table 2 listing all the DE miRNAs </w:t>
-      </w:r>
-      <w:proofErr w:type="gramStart"/>
-      <w:r>
-        <w:t>is</w:t>
-      </w:r>
-      <w:proofErr w:type="gramEnd"/>
-      <w:r>
-        <w:t xml:space="preserve"> wrong for all the protease samples – it just shows the der p 1 inactive results for each of the protease conditions. </w:t>
+        <w:t xml:space="preserve">Supplementary table 2 listing all the DE miRNAs is wrong for all the protease samples – it just shows the der p 1 inactive results for each of the protease conditions. </w:t>
       </w:r>
       <w:r>
         <w:rPr>
@@ -515,33 +499,90 @@
           <w:b/>
           <w:bCs/>
         </w:rPr>
-        <w:t xml:space="preserve">in the local </w:t>
-      </w:r>
-      <w:proofErr w:type="spellStart"/>
+        <w:t>in the local github folder but not pushed it</w:t>
+      </w:r>
+    </w:p>
+    <w:p/>
+    <w:p>
       <w:r>
         <w:rPr>
           <w:b/>
           <w:bCs/>
         </w:rPr>
-        <w:t>github</w:t>
-      </w:r>
-      <w:proofErr w:type="spellEnd"/>
+        <w:t>Anticipated Questions</w:t>
+      </w:r>
+    </w:p>
+    <w:p>
+      <w:pPr>
+        <w:pStyle w:val="ListParagraph"/>
+        <w:numPr>
+          <w:ilvl w:val="0"/>
+          <w:numId w:val="5"/>
+        </w:numPr>
+      </w:pPr>
+      <w:r>
+        <w:t xml:space="preserve">Why did you only perform ORA during target-gene enrichment but you performed ORA and miRNA-SEA at miRNA-level? </w:t>
+      </w:r>
+    </w:p>
+    <w:p>
+      <w:pPr>
+        <w:pStyle w:val="ListParagraph"/>
+        <w:numPr>
+          <w:ilvl w:val="1"/>
+          <w:numId w:val="5"/>
+        </w:numPr>
+      </w:pPr>
       <w:r>
         <w:rPr>
           <w:b/>
           <w:bCs/>
         </w:rPr>
-        <w:t xml:space="preserve"> folder but not pushed it</w:t>
-      </w:r>
-    </w:p>
-    <w:p/>
-    <w:p>
+        <w:t>Could have used gsePathway()…</w:t>
+      </w:r>
+    </w:p>
+    <w:p>
+      <w:pPr>
+        <w:pStyle w:val="ListParagraph"/>
+        <w:numPr>
+          <w:ilvl w:val="0"/>
+          <w:numId w:val="5"/>
+        </w:numPr>
+      </w:pPr>
+      <w:r>
+        <w:t>miRNA-level ORA may not have shown many significant pathways for the reasons set out in the discussion section but also because the background list of miRNAs (those observed in the experiment – kept after edgeR filtering) might not have been large enough?</w:t>
+      </w:r>
+    </w:p>
+    <w:p>
+      <w:pPr>
+        <w:pStyle w:val="ListParagraph"/>
+        <w:numPr>
+          <w:ilvl w:val="0"/>
+          <w:numId w:val="5"/>
+        </w:numPr>
+      </w:pPr>
+      <w:r>
+        <w:t xml:space="preserve">Why did you use a higher significance threshold for miRNA-level enrichment (Padj &lt; 0.05) over target gene (Padj &lt; 0.02)? </w:t>
+      </w:r>
       <w:r>
         <w:rPr>
           <w:b/>
           <w:bCs/>
         </w:rPr>
-        <w:t>Anticipated Questions</w:t>
+        <w:t xml:space="preserve">Because there are fewer miRNA-pathway relationships and therefore there are likely to be fewer very significant pathways, so I didn’t want to miss anything by using a stricter threshold. Whereas, for target gene enrichment, the higher significance caused almost half of all </w:t>
+      </w:r>
+      <w:r>
+        <w:rPr>
+          <w:b/>
+          <w:bCs/>
+        </w:rPr>
+        <w:t>Reactome</w:t>
+      </w:r>
+      <w:r>
+        <w:rPr>
+          <w:b/>
+          <w:bCs/>
+        </w:rPr>
+        <w:t xml:space="preserve"> pathways (in the database) to be significant which is not specific enough.</w:t>
       </w:r>
     </w:p>
     <w:p>
@@ -553,15 +594,7 @@
         </w:numPr>
       </w:pPr>
       <w:r>
-        <w:t xml:space="preserve">Why did you only perform ORA during target-gene </w:t>
-      </w:r>
-      <w:proofErr w:type="gramStart"/>
-      <w:r>
-        <w:t>enrichment</w:t>
-      </w:r>
-      <w:proofErr w:type="gramEnd"/>
-      <w:r>
-        <w:t xml:space="preserve"> but you performed ORA and miRNA-SEA at miRNA-level? </w:t>
+        <w:t>What would you do in the future, given more time and/or money?</w:t>
       </w:r>
     </w:p>
     <w:p>
@@ -577,32 +610,59 @@
           <w:b/>
           <w:bCs/>
         </w:rPr>
-        <w:t xml:space="preserve">Could have used </w:t>
-      </w:r>
-      <w:proofErr w:type="spellStart"/>
-      <w:proofErr w:type="gramStart"/>
+        <w:t>Use the commercial platform used in the original primary HBEC study to benchmark my results against.</w:t>
+      </w:r>
+    </w:p>
+    <w:p>
+      <w:pPr>
+        <w:pStyle w:val="ListParagraph"/>
+        <w:numPr>
+          <w:ilvl w:val="1"/>
+          <w:numId w:val="5"/>
+        </w:numPr>
+      </w:pPr>
       <w:r>
         <w:rPr>
           <w:b/>
           <w:bCs/>
         </w:rPr>
-        <w:t>gsePathway</w:t>
-      </w:r>
-      <w:proofErr w:type="spellEnd"/>
+        <w:lastRenderedPageBreak/>
+        <w:t>Could look at detecting different types of small rna species e.g., what tamirna does in their reads classification table</w:t>
+      </w:r>
+    </w:p>
+    <w:p>
+      <w:pPr>
+        <w:pStyle w:val="ListParagraph"/>
+        <w:numPr>
+          <w:ilvl w:val="1"/>
+          <w:numId w:val="5"/>
+        </w:numPr>
+      </w:pPr>
       <w:r>
         <w:rPr>
           <w:b/>
           <w:bCs/>
         </w:rPr>
-        <w:t>(</w:t>
-      </w:r>
-      <w:proofErr w:type="gramEnd"/>
+        <w:t>Repeat the analysis with matched miRNA-mRNA data.</w:t>
+      </w:r>
+    </w:p>
+    <w:p>
+      <w:pPr>
+        <w:pStyle w:val="ListParagraph"/>
+        <w:numPr>
+          <w:ilvl w:val="0"/>
+          <w:numId w:val="5"/>
+        </w:numPr>
+      </w:pPr>
+      <w:r>
+        <w:t xml:space="preserve">Why does the low miRNA abundance in the Calu-3 dataset constrain differential expression analysis? </w:t>
+      </w:r>
       <w:r>
         <w:rPr>
           <w:b/>
           <w:bCs/>
         </w:rPr>
-        <w:t>)…</w:t>
+        <w:t>Low statistical power as the differences in expression may seem inflated at lower counts, more miRNAs may be filtered by edgeR as they appear to not express the miRNA when they actually do which alters the statistical model, fails to capture the true transcriptome of the cells, [examples of more miRNA abundance being used/necessary]</w:t>
       </w:r>
     </w:p>
     <w:p>
@@ -614,7 +674,39 @@
         </w:numPr>
       </w:pPr>
       <w:r>
-        <w:t>miRNA-level ORA may not have shown many significant pathways for the reasons set out in the discussion section but also because the background list of miRNAs (those observed in the experiment – kept after edgeR filtering) might not have been large enough?</w:t>
+        <w:t xml:space="preserve">Why do the same pathways appear in both upregulated and downregulated DE miRNAs for target gene-level enrichment? </w:t>
+      </w:r>
+    </w:p>
+    <w:p>
+      <w:pPr>
+        <w:pStyle w:val="ListParagraph"/>
+        <w:numPr>
+          <w:ilvl w:val="1"/>
+          <w:numId w:val="5"/>
+        </w:numPr>
+      </w:pPr>
+      <w:r>
+        <w:rPr>
+          <w:b/>
+          <w:bCs/>
+        </w:rPr>
+        <w:t>It is possible that they’re working antagonistically which could be a bit odd or the miRNAs might not actually be acting on the target genes involved in the pathway because this is just a hypothesis and there isn’t matching mRNA data to identify miRNA-mRNA relationships</w:t>
+      </w:r>
+    </w:p>
+    <w:p>
+      <w:pPr>
+        <w:pStyle w:val="ListParagraph"/>
+        <w:numPr>
+          <w:ilvl w:val="1"/>
+          <w:numId w:val="5"/>
+        </w:numPr>
+      </w:pPr>
+      <w:r>
+        <w:rPr>
+          <w:b/>
+          <w:bCs/>
+        </w:rPr>
+        <w:t>It is also possible that they are working agonistically because the target genes being targeted by upregulated are stimulatory and the downregulated ones are inhibitory therefore they are working in the same direction</w:t>
       </w:r>
     </w:p>
     <w:p>
@@ -626,46 +718,97 @@
         </w:numPr>
       </w:pPr>
       <w:r>
-        <w:t>Why did you use a higher significance threshold for miRNA-level enrichment (</w:t>
-      </w:r>
-      <w:proofErr w:type="spellStart"/>
-      <w:r>
-        <w:t>Padj</w:t>
-      </w:r>
-      <w:proofErr w:type="spellEnd"/>
-      <w:r>
-        <w:t xml:space="preserve"> &lt; 0.05) over target gene (</w:t>
-      </w:r>
-      <w:proofErr w:type="spellStart"/>
-      <w:r>
-        <w:t>Padj</w:t>
-      </w:r>
-      <w:proofErr w:type="spellEnd"/>
-      <w:r>
-        <w:t xml:space="preserve"> &lt; 0.02)? </w:t>
+        <w:t>How do WNT and NOTCH regulate epithelial barrier integrity in the upregulated target gene pathways and RHO GTPases in the downregulated?</w:t>
+      </w:r>
+    </w:p>
+    <w:p>
+      <w:pPr>
+        <w:pStyle w:val="ListParagraph"/>
+        <w:numPr>
+          <w:ilvl w:val="0"/>
+          <w:numId w:val="5"/>
+        </w:numPr>
+      </w:pPr>
+      <w:r>
+        <w:t xml:space="preserve">Why is RT-qPCR necessary if you already have small RNA-seq data? </w:t>
       </w:r>
       <w:r>
         <w:rPr>
           <w:b/>
           <w:bCs/>
         </w:rPr>
-        <w:t xml:space="preserve">Because there are fewer miRNA-pathway relationships and therefore there are likely to be fewer very significant pathways, so I didn’t want to miss anything by using a stricter threshold. Whereas, for target gene enrichment, the higher significance caused almost half of all </w:t>
-      </w:r>
-      <w:proofErr w:type="spellStart"/>
+        <w:t>Small RNA-seq is genome-wide whereas PCR is very specific. Using both methods reduces the risk that results were found due to technical artefacts.</w:t>
+      </w:r>
+    </w:p>
+    <w:p>
+      <w:pPr>
+        <w:pStyle w:val="ListParagraph"/>
+        <w:numPr>
+          <w:ilvl w:val="0"/>
+          <w:numId w:val="5"/>
+        </w:numPr>
+      </w:pPr>
+      <w:r>
+        <w:t xml:space="preserve">You say more work is required to confirm that higher levels of rRNA and tRNA are observed in the three dose 24 primary HBEC samples. What further work would you do to confirm this? </w:t>
+      </w:r>
       <w:r>
         <w:rPr>
           <w:b/>
           <w:bCs/>
         </w:rPr>
-        <w:t>Reactome</w:t>
-      </w:r>
-      <w:proofErr w:type="spellEnd"/>
+        <w:t>More samples, more donors, look at more RNA species other than just rRNA and tRNA – can use databases containing these sequences to perform this.</w:t>
+      </w:r>
+    </w:p>
+    <w:p>
+      <w:pPr>
+        <w:pStyle w:val="ListParagraph"/>
+        <w:numPr>
+          <w:ilvl w:val="0"/>
+          <w:numId w:val="5"/>
+        </w:numPr>
+      </w:pPr>
+      <w:r>
+        <w:t xml:space="preserve">What was the greatest challenge of the project? </w:t>
+      </w:r>
+    </w:p>
+    <w:p>
+      <w:pPr>
+        <w:pStyle w:val="ListParagraph"/>
+        <w:numPr>
+          <w:ilvl w:val="1"/>
+          <w:numId w:val="5"/>
+        </w:numPr>
+      </w:pPr>
       <w:r>
         <w:rPr>
           <w:b/>
           <w:bCs/>
         </w:rPr>
-        <w:t xml:space="preserve"> pathways (in the database) to be significant which is not specific enough.</w:t>
+        <w:t>The greatest technical challenge was developing the method for the pathway enrichment analysis because there were so many target genes that it was almost the whole proteome and there were so many different filtering techniques that weren’t biologically robust enough or were locked behind paywalls or lack of matched mRNA data.</w:t>
+      </w:r>
+    </w:p>
+    <w:p>
+      <w:pPr>
+        <w:pStyle w:val="ListParagraph"/>
+        <w:numPr>
+          <w:ilvl w:val="1"/>
+          <w:numId w:val="5"/>
+        </w:numPr>
+      </w:pPr>
+      <w:r>
+        <w:rPr>
+          <w:b/>
+          <w:bCs/>
+        </w:rPr>
+        <w:t xml:space="preserve">The greatest overall challenge was deciding what the project was actually about. Because I received the data in a staggered way, the aim of the project kept changing based on the results of the data as I could no longer do what I set out to do. This is a good example of how projects can change over time and when you are doing stuff in a short </w:t>
+      </w:r>
+      <w:r>
+        <w:rPr>
+          <w:b/>
+          <w:bCs/>
+        </w:rPr>
+        <w:lastRenderedPageBreak/>
+        <w:t>time period, you may not be able to reach the depth of analysis you might like to.</w:t>
       </w:r>
     </w:p>
     <w:p>
@@ -677,7 +820,7 @@
         </w:numPr>
       </w:pPr>
       <w:r>
-        <w:t>What would you do in the future, given more time and/or money?</w:t>
+        <w:t xml:space="preserve">You say very low levels of miRNA were detected – what would be an acceptable level of miRNA for this experiment and how would you suggest it be extracted? </w:t>
       </w:r>
     </w:p>
     <w:p>
@@ -693,313 +836,6 @@
           <w:b/>
           <w:bCs/>
         </w:rPr>
-        <w:t xml:space="preserve">Could look at detecting different types of small </w:t>
-      </w:r>
-      <w:proofErr w:type="spellStart"/>
-      <w:r>
-        <w:rPr>
-          <w:b/>
-          <w:bCs/>
-        </w:rPr>
-        <w:t>rna</w:t>
-      </w:r>
-      <w:proofErr w:type="spellEnd"/>
-      <w:r>
-        <w:rPr>
-          <w:b/>
-          <w:bCs/>
-        </w:rPr>
-        <w:t xml:space="preserve"> species e.g., what </w:t>
-      </w:r>
-      <w:proofErr w:type="spellStart"/>
-      <w:r>
-        <w:rPr>
-          <w:b/>
-          <w:bCs/>
-        </w:rPr>
-        <w:t>tamirna</w:t>
-      </w:r>
-      <w:proofErr w:type="spellEnd"/>
-      <w:r>
-        <w:rPr>
-          <w:b/>
-          <w:bCs/>
-        </w:rPr>
-        <w:t xml:space="preserve"> does in their </w:t>
-      </w:r>
-      <w:proofErr w:type="gramStart"/>
-      <w:r>
-        <w:rPr>
-          <w:b/>
-          <w:bCs/>
-        </w:rPr>
-        <w:t>reads</w:t>
-      </w:r>
-      <w:proofErr w:type="gramEnd"/>
-      <w:r>
-        <w:rPr>
-          <w:b/>
-          <w:bCs/>
-        </w:rPr>
-        <w:t xml:space="preserve"> classification table</w:t>
-      </w:r>
-    </w:p>
-    <w:p>
-      <w:pPr>
-        <w:pStyle w:val="ListParagraph"/>
-        <w:numPr>
-          <w:ilvl w:val="0"/>
-          <w:numId w:val="5"/>
-        </w:numPr>
-      </w:pPr>
-      <w:r>
-        <w:lastRenderedPageBreak/>
-        <w:t xml:space="preserve">Why does the low miRNA abundance in the Calu-3 dataset constrain differential expression analysis? </w:t>
-      </w:r>
-      <w:r>
-        <w:rPr>
-          <w:b/>
-          <w:bCs/>
-        </w:rPr>
-        <w:t>Low statistical power as the differences in expression may seem inflated at lower counts, more miRNAs may be filtered by edgeR as they appear to not express the miRNA when they actually do which alters the statistical model, fails to capture the true transcriptome of the cells, [examples of more miRNA abundance being used/necessary]</w:t>
-      </w:r>
-    </w:p>
-    <w:p>
-      <w:pPr>
-        <w:pStyle w:val="ListParagraph"/>
-        <w:numPr>
-          <w:ilvl w:val="0"/>
-          <w:numId w:val="5"/>
-        </w:numPr>
-      </w:pPr>
-      <w:r>
-        <w:t xml:space="preserve">Why do the same pathways appear in both upregulated and downregulated DE miRNAs for target gene-level enrichment? </w:t>
-      </w:r>
-    </w:p>
-    <w:p>
-      <w:pPr>
-        <w:pStyle w:val="ListParagraph"/>
-        <w:numPr>
-          <w:ilvl w:val="1"/>
-          <w:numId w:val="5"/>
-        </w:numPr>
-      </w:pPr>
-      <w:r>
-        <w:rPr>
-          <w:b/>
-          <w:bCs/>
-        </w:rPr>
-        <w:t>It is possible that they’re working antagonistically which could be a bit odd or the miRNAs might not actually be acting on the target genes involved in the pathway because this is just a hypothesis and there isn’t matching mRNA data to identify miRNA-mRNA relationships</w:t>
-      </w:r>
-    </w:p>
-    <w:p>
-      <w:pPr>
-        <w:pStyle w:val="ListParagraph"/>
-        <w:numPr>
-          <w:ilvl w:val="1"/>
-          <w:numId w:val="5"/>
-        </w:numPr>
-      </w:pPr>
-      <w:r>
-        <w:rPr>
-          <w:b/>
-          <w:bCs/>
-        </w:rPr>
-        <w:t xml:space="preserve">It is also possible that they are working agonistically because the target genes being targeted by upregulated are stimulatory and the downregulated ones are inhibitory </w:t>
-      </w:r>
-      <w:proofErr w:type="gramStart"/>
-      <w:r>
-        <w:rPr>
-          <w:b/>
-          <w:bCs/>
-        </w:rPr>
-        <w:t>therefore</w:t>
-      </w:r>
-      <w:proofErr w:type="gramEnd"/>
-      <w:r>
-        <w:rPr>
-          <w:b/>
-          <w:bCs/>
-        </w:rPr>
-        <w:t xml:space="preserve"> they are working in the same direction</w:t>
-      </w:r>
-    </w:p>
-    <w:p>
-      <w:pPr>
-        <w:pStyle w:val="ListParagraph"/>
-        <w:numPr>
-          <w:ilvl w:val="0"/>
-          <w:numId w:val="5"/>
-        </w:numPr>
-      </w:pPr>
-      <w:r>
-        <w:t>How do WNT and NOTCH regulate epithelial barrier integrity in the upregulated target gene pathways and RHO GTPases in the downregulated?</w:t>
-      </w:r>
-    </w:p>
-    <w:p>
-      <w:pPr>
-        <w:pStyle w:val="ListParagraph"/>
-        <w:numPr>
-          <w:ilvl w:val="0"/>
-          <w:numId w:val="5"/>
-        </w:numPr>
-      </w:pPr>
-      <w:r>
-        <w:t>Why is RT-qPCR necessary if you already have small RNA-</w:t>
-      </w:r>
-      <w:proofErr w:type="spellStart"/>
-      <w:r>
-        <w:t>seq</w:t>
-      </w:r>
-      <w:proofErr w:type="spellEnd"/>
-      <w:r>
-        <w:t xml:space="preserve"> data? </w:t>
-      </w:r>
-      <w:r>
-        <w:rPr>
-          <w:b/>
-          <w:bCs/>
-        </w:rPr>
-        <w:t>Small RNA-</w:t>
-      </w:r>
-      <w:proofErr w:type="spellStart"/>
-      <w:r>
-        <w:rPr>
-          <w:b/>
-          <w:bCs/>
-        </w:rPr>
-        <w:t>seq</w:t>
-      </w:r>
-      <w:proofErr w:type="spellEnd"/>
-      <w:r>
-        <w:rPr>
-          <w:b/>
-          <w:bCs/>
-        </w:rPr>
-        <w:t xml:space="preserve"> is genome-wide whereas PCR is very specific. Using both methods reduces the risk that results were found due to technical artefacts.</w:t>
-      </w:r>
-    </w:p>
-    <w:p>
-      <w:pPr>
-        <w:pStyle w:val="ListParagraph"/>
-        <w:numPr>
-          <w:ilvl w:val="0"/>
-          <w:numId w:val="5"/>
-        </w:numPr>
-      </w:pPr>
-      <w:r>
-        <w:t xml:space="preserve">You say more work is required to confirm that higher levels of rRNA and tRNA are observed in the three dose 24 primary HBEC samples. What further work would you do to confirm this? </w:t>
-      </w:r>
-      <w:r>
-        <w:rPr>
-          <w:b/>
-          <w:bCs/>
-        </w:rPr>
-        <w:t>More samples, more donors, look at more RNA species other than just rRNA and tRNA – can use databases containing these sequences to perform this.</w:t>
-      </w:r>
-    </w:p>
-    <w:p>
-      <w:pPr>
-        <w:pStyle w:val="ListParagraph"/>
-        <w:numPr>
-          <w:ilvl w:val="0"/>
-          <w:numId w:val="5"/>
-        </w:numPr>
-      </w:pPr>
-      <w:r>
-        <w:t xml:space="preserve">What was the greatest challenge of the project? </w:t>
-      </w:r>
-    </w:p>
-    <w:p>
-      <w:pPr>
-        <w:pStyle w:val="ListParagraph"/>
-        <w:numPr>
-          <w:ilvl w:val="1"/>
-          <w:numId w:val="5"/>
-        </w:numPr>
-      </w:pPr>
-      <w:r>
-        <w:rPr>
-          <w:b/>
-          <w:bCs/>
-        </w:rPr>
-        <w:t>The greatest technical challenge was developing the method for the pathway enrichment analysis because there were so many target genes that it was almost the whole proteome and there were so many different filtering techniques that weren’t biologically robust enough or were locked behind paywalls or lack of matched mRNA data.</w:t>
-      </w:r>
-    </w:p>
-    <w:p>
-      <w:pPr>
-        <w:pStyle w:val="ListParagraph"/>
-        <w:numPr>
-          <w:ilvl w:val="1"/>
-          <w:numId w:val="5"/>
-        </w:numPr>
-      </w:pPr>
-      <w:r>
-        <w:rPr>
-          <w:b/>
-          <w:bCs/>
-        </w:rPr>
-        <w:t xml:space="preserve">The greatest overall challenge was deciding what the project was </w:t>
-      </w:r>
-      <w:proofErr w:type="gramStart"/>
-      <w:r>
-        <w:rPr>
-          <w:b/>
-          <w:bCs/>
-        </w:rPr>
-        <w:t>actually about</w:t>
-      </w:r>
-      <w:proofErr w:type="gramEnd"/>
-      <w:r>
-        <w:rPr>
-          <w:b/>
-          <w:bCs/>
-        </w:rPr>
-        <w:t xml:space="preserve">. Because I received the data in a staggered way, the aim of the project kept changing based on the results of the data as I could no longer do what I set out to do. This is a good example of how projects can change over time and when you are doing stuff in a short </w:t>
-      </w:r>
-      <w:proofErr w:type="gramStart"/>
-      <w:r>
-        <w:rPr>
-          <w:b/>
-          <w:bCs/>
-        </w:rPr>
-        <w:t>time period</w:t>
-      </w:r>
-      <w:proofErr w:type="gramEnd"/>
-      <w:r>
-        <w:rPr>
-          <w:b/>
-          <w:bCs/>
-        </w:rPr>
-        <w:t>, you may not be able to reach the depth of analysis you might like to.</w:t>
-      </w:r>
-    </w:p>
-    <w:p>
-      <w:pPr>
-        <w:pStyle w:val="ListParagraph"/>
-        <w:numPr>
-          <w:ilvl w:val="0"/>
-          <w:numId w:val="5"/>
-        </w:numPr>
-      </w:pPr>
-      <w:r>
-        <w:t xml:space="preserve">You say very low levels of miRNA were detected – what would be an acceptable level of miRNA for this experiment and how would you suggest it be extracted? </w:t>
-      </w:r>
-    </w:p>
-    <w:p>
-      <w:pPr>
-        <w:pStyle w:val="ListParagraph"/>
-        <w:numPr>
-          <w:ilvl w:val="1"/>
-          <w:numId w:val="5"/>
-        </w:numPr>
-      </w:pPr>
-      <w:r>
-        <w:rPr>
-          <w:b/>
-          <w:bCs/>
-        </w:rPr>
-        <w:lastRenderedPageBreak/>
         <w:t xml:space="preserve">[check references for how much miRNA other studies used]. More samples could help compensate for lower levels of miRNA. </w:t>
       </w:r>
     </w:p>

</xml_diff>